<commit_message>
her letter update (oops forgot a part)
</commit_message>
<xml_diff>
--- a/content/poetry/her-letter/2023-10 - her letter.docx
+++ b/content/poetry/her-letter/2023-10 - her letter.docx
@@ -89,22 +89,7 @@
           <w:szCs w:val="24"/>
         </w:rPr>
         <w:br/>
-      </w:r>
-      <w:r>
-        <w:rPr>
-          <w:rFonts w:ascii="Aptos" w:hAnsi="Aptos"/>
-          <w:sz w:val="24"/>
-          <w:szCs w:val="24"/>
-        </w:rPr>
-        <w:t>cherish</w:t>
-      </w:r>
-      <w:r>
-        <w:rPr>
-          <w:rFonts w:ascii="Aptos" w:hAnsi="Aptos"/>
-          <w:sz w:val="24"/>
-          <w:szCs w:val="24"/>
-        </w:rPr>
-        <w:t>, do i, these brief tangles together,</w:t>
+        <w:t>cherish, do i, these brief tangles together,</w:t>
       </w:r>
       <w:r>
         <w:rPr>
@@ -174,7 +159,7 @@
           <w:szCs w:val="24"/>
         </w:rPr>
         <w:br/>
-        <w:t>near enough to feel your breathe,</w:t>
+        <w:t>near enough to feel you breathe,</w:t>
       </w:r>
       <w:r>
         <w:rPr>
@@ -211,6 +196,358 @@
         </w:rPr>
         <w:br/>
         <w:t>till then, i remain yours</w:t>
+      </w:r>
+    </w:p>
+    <w:p>
+      <w:pPr>
+        <w:rPr>
+          <w:rFonts w:ascii="Aptos" w:hAnsi="Aptos"/>
+          <w:b/>
+          <w:bCs/>
+          <w:sz w:val="24"/>
+          <w:szCs w:val="24"/>
+        </w:rPr>
+      </w:pPr>
+      <w:r>
+        <w:rPr>
+          <w:rFonts w:ascii="Aptos" w:hAnsi="Aptos"/>
+          <w:b/>
+          <w:bCs/>
+          <w:sz w:val="24"/>
+          <w:szCs w:val="24"/>
+        </w:rPr>
+        <w:t>writer’s thoughts</w:t>
+      </w:r>
+    </w:p>
+    <w:p>
+      <w:pPr>
+        <w:rPr>
+          <w:rFonts w:ascii="Aptos" w:hAnsi="Aptos"/>
+          <w:sz w:val="24"/>
+          <w:szCs w:val="24"/>
+        </w:rPr>
+      </w:pPr>
+      <w:r>
+        <w:rPr>
+          <w:rFonts w:ascii="Aptos" w:hAnsi="Aptos"/>
+          <w:sz w:val="24"/>
+          <w:szCs w:val="24"/>
+        </w:rPr>
+        <w:t>nestled in a velveteen envelope,</w:t>
+      </w:r>
+      <w:r>
+        <w:rPr>
+          <w:rFonts w:ascii="Aptos" w:hAnsi="Aptos"/>
+          <w:sz w:val="24"/>
+          <w:szCs w:val="24"/>
+        </w:rPr>
+        <w:br/>
+        <w:t>her intentions wrapped in prose –</w:t>
+      </w:r>
+      <w:r>
+        <w:rPr>
+          <w:rFonts w:ascii="Aptos" w:hAnsi="Aptos"/>
+          <w:sz w:val="24"/>
+          <w:szCs w:val="24"/>
+        </w:rPr>
+        <w:br/>
+        <w:t>each stroke of the pen</w:t>
+      </w:r>
+      <w:r>
+        <w:rPr>
+          <w:rFonts w:ascii="Aptos" w:hAnsi="Aptos"/>
+          <w:sz w:val="24"/>
+          <w:szCs w:val="24"/>
+        </w:rPr>
+        <w:br/>
+        <w:t>deliberate</w:t>
+      </w:r>
+    </w:p>
+    <w:p>
+      <w:pPr>
+        <w:rPr>
+          <w:rFonts w:ascii="Aptos" w:hAnsi="Aptos"/>
+          <w:sz w:val="24"/>
+          <w:szCs w:val="24"/>
+        </w:rPr>
+      </w:pPr>
+      <w:r>
+        <w:rPr>
+          <w:rFonts w:ascii="Aptos" w:hAnsi="Aptos"/>
+          <w:sz w:val="24"/>
+          <w:szCs w:val="24"/>
+        </w:rPr>
+        <w:t>brown eyes, flushed cheeks,</w:t>
+      </w:r>
+      <w:r>
+        <w:rPr>
+          <w:rFonts w:ascii="Aptos" w:hAnsi="Aptos"/>
+          <w:sz w:val="24"/>
+          <w:szCs w:val="24"/>
+        </w:rPr>
+        <w:br/>
+        <w:t>the curtain about to rise,</w:t>
+      </w:r>
+      <w:r>
+        <w:rPr>
+          <w:rFonts w:ascii="Aptos" w:hAnsi="Aptos"/>
+          <w:sz w:val="24"/>
+          <w:szCs w:val="24"/>
+        </w:rPr>
+        <w:br/>
+        <w:t>the show about to start</w:t>
+      </w:r>
+    </w:p>
+    <w:p>
+      <w:pPr>
+        <w:rPr>
+          <w:rFonts w:ascii="Aptos" w:hAnsi="Aptos"/>
+          <w:sz w:val="24"/>
+          <w:szCs w:val="24"/>
+        </w:rPr>
+      </w:pPr>
+      <w:r>
+        <w:rPr>
+          <w:rFonts w:ascii="Aptos" w:hAnsi="Aptos"/>
+          <w:sz w:val="24"/>
+          <w:szCs w:val="24"/>
+        </w:rPr>
+        <w:t>the tilt of her neck,</w:t>
+      </w:r>
+      <w:r>
+        <w:rPr>
+          <w:rFonts w:ascii="Aptos" w:hAnsi="Aptos"/>
+          <w:sz w:val="24"/>
+          <w:szCs w:val="24"/>
+        </w:rPr>
+        <w:br/>
+        <w:t>a meticulous welcome</w:t>
+      </w:r>
+      <w:r>
+        <w:rPr>
+          <w:rFonts w:ascii="Aptos" w:hAnsi="Aptos"/>
+          <w:sz w:val="24"/>
+          <w:szCs w:val="24"/>
+        </w:rPr>
+        <w:t>.</w:t>
+      </w:r>
+      <w:r>
+        <w:rPr>
+          <w:rFonts w:ascii="Aptos" w:hAnsi="Aptos"/>
+          <w:sz w:val="24"/>
+          <w:szCs w:val="24"/>
+        </w:rPr>
+        <w:br/>
+        <w:t>i can taste her.</w:t>
+      </w:r>
+    </w:p>
+    <w:p>
+      <w:pPr>
+        <w:rPr>
+          <w:rFonts w:ascii="Aptos" w:hAnsi="Aptos"/>
+          <w:sz w:val="24"/>
+          <w:szCs w:val="24"/>
+        </w:rPr>
+      </w:pPr>
+      <w:r>
+        <w:rPr>
+          <w:rFonts w:ascii="Aptos" w:hAnsi="Aptos"/>
+          <w:sz w:val="24"/>
+          <w:szCs w:val="24"/>
+        </w:rPr>
+        <w:t>she shudders</w:t>
+      </w:r>
+      <w:r>
+        <w:rPr>
+          <w:rFonts w:ascii="Aptos" w:hAnsi="Aptos"/>
+          <w:sz w:val="24"/>
+          <w:szCs w:val="24"/>
+        </w:rPr>
+        <w:br/>
+        <w:t>as if she’s read my mind,</w:t>
+      </w:r>
+      <w:r>
+        <w:rPr>
+          <w:rFonts w:ascii="Aptos" w:hAnsi="Aptos"/>
+          <w:sz w:val="24"/>
+          <w:szCs w:val="24"/>
+        </w:rPr>
+        <w:br/>
+        <w:t>and her hands guide my eyes,</w:t>
+      </w:r>
+      <w:r>
+        <w:rPr>
+          <w:rFonts w:ascii="Aptos" w:hAnsi="Aptos"/>
+          <w:sz w:val="24"/>
+          <w:szCs w:val="24"/>
+        </w:rPr>
+        <w:br/>
+        <w:t>then my hands,</w:t>
+      </w:r>
+      <w:r>
+        <w:rPr>
+          <w:rFonts w:ascii="Aptos" w:hAnsi="Aptos"/>
+          <w:sz w:val="24"/>
+          <w:szCs w:val="24"/>
+        </w:rPr>
+        <w:br/>
+        <w:t>to what i want to touch:</w:t>
+      </w:r>
+    </w:p>
+    <w:p>
+      <w:pPr>
+        <w:rPr>
+          <w:rFonts w:ascii="Aptos" w:hAnsi="Aptos"/>
+          <w:sz w:val="24"/>
+          <w:szCs w:val="24"/>
+        </w:rPr>
+      </w:pPr>
+      <w:r>
+        <w:rPr>
+          <w:rFonts w:ascii="Aptos" w:hAnsi="Aptos"/>
+          <w:sz w:val="24"/>
+          <w:szCs w:val="24"/>
+        </w:rPr>
+        <w:t>the nape of her neck,</w:t>
+      </w:r>
+      <w:r>
+        <w:rPr>
+          <w:rFonts w:ascii="Aptos" w:hAnsi="Aptos"/>
+          <w:sz w:val="24"/>
+          <w:szCs w:val="24"/>
+        </w:rPr>
+        <w:br/>
+        <w:t>her breasts – i’ll come back for those –</w:t>
+      </w:r>
+      <w:r>
+        <w:rPr>
+          <w:rFonts w:ascii="Aptos" w:hAnsi="Aptos"/>
+          <w:sz w:val="24"/>
+          <w:szCs w:val="24"/>
+        </w:rPr>
+        <w:br/>
+      </w:r>
+      <w:r>
+        <w:rPr>
+          <w:rFonts w:ascii="Aptos" w:hAnsi="Aptos"/>
+          <w:sz w:val="24"/>
+          <w:szCs w:val="24"/>
+        </w:rPr>
+        <w:lastRenderedPageBreak/>
+        <w:t>the slope past her navel,</w:t>
+      </w:r>
+      <w:r>
+        <w:rPr>
+          <w:rFonts w:ascii="Aptos" w:hAnsi="Aptos"/>
+          <w:sz w:val="24"/>
+          <w:szCs w:val="24"/>
+        </w:rPr>
+        <w:br/>
+        <w:t>home amid bare thighs</w:t>
+      </w:r>
+    </w:p>
+    <w:p>
+      <w:pPr>
+        <w:rPr>
+          <w:rFonts w:ascii="Aptos" w:hAnsi="Aptos"/>
+          <w:sz w:val="24"/>
+          <w:szCs w:val="24"/>
+        </w:rPr>
+      </w:pPr>
+      <w:r>
+        <w:rPr>
+          <w:rFonts w:ascii="Aptos" w:hAnsi="Aptos"/>
+          <w:sz w:val="24"/>
+          <w:szCs w:val="24"/>
+        </w:rPr>
+        <w:t>all that grace,</w:t>
+      </w:r>
+      <w:r>
+        <w:rPr>
+          <w:rFonts w:ascii="Aptos" w:hAnsi="Aptos"/>
+          <w:sz w:val="24"/>
+          <w:szCs w:val="24"/>
+        </w:rPr>
+        <w:br/>
+        <w:t>all that elegance</w:t>
+      </w:r>
+      <w:r>
+        <w:rPr>
+          <w:rFonts w:ascii="Aptos" w:hAnsi="Aptos"/>
+          <w:sz w:val="24"/>
+          <w:szCs w:val="24"/>
+        </w:rPr>
+        <w:t>,</w:t>
+      </w:r>
+      <w:r>
+        <w:rPr>
+          <w:rFonts w:ascii="Aptos" w:hAnsi="Aptos"/>
+          <w:sz w:val="24"/>
+          <w:szCs w:val="24"/>
+        </w:rPr>
+        <w:br/>
+        <w:t>drowned out by hunger</w:t>
+      </w:r>
+    </w:p>
+    <w:p>
+      <w:pPr>
+        <w:rPr>
+          <w:rFonts w:ascii="Aptos" w:hAnsi="Aptos"/>
+          <w:sz w:val="24"/>
+          <w:szCs w:val="24"/>
+        </w:rPr>
+      </w:pPr>
+      <w:r>
+        <w:rPr>
+          <w:rFonts w:ascii="Aptos" w:hAnsi="Aptos"/>
+          <w:sz w:val="24"/>
+          <w:szCs w:val="24"/>
+        </w:rPr>
+        <w:t>she lies back</w:t>
+      </w:r>
+      <w:r>
+        <w:rPr>
+          <w:rFonts w:ascii="Aptos" w:hAnsi="Aptos"/>
+          <w:sz w:val="24"/>
+          <w:szCs w:val="24"/>
+        </w:rPr>
+        <w:br/>
+        <w:t>and parts</w:t>
+      </w:r>
+      <w:r>
+        <w:rPr>
+          <w:rFonts w:ascii="Aptos" w:hAnsi="Aptos"/>
+          <w:sz w:val="24"/>
+          <w:szCs w:val="24"/>
+        </w:rPr>
+        <w:br/>
+        <w:t>like the curtain</w:t>
+      </w:r>
+    </w:p>
+    <w:p>
+      <w:pPr>
+        <w:rPr>
+          <w:rFonts w:ascii="Aptos" w:hAnsi="Aptos"/>
+          <w:sz w:val="24"/>
+          <w:szCs w:val="24"/>
+        </w:rPr>
+      </w:pPr>
+      <w:r>
+        <w:rPr>
+          <w:rFonts w:ascii="Aptos" w:hAnsi="Aptos"/>
+          <w:sz w:val="24"/>
+          <w:szCs w:val="24"/>
+        </w:rPr>
+        <w:t>encore.</w:t>
+      </w:r>
+      <w:r>
+        <w:rPr>
+          <w:rFonts w:ascii="Aptos" w:hAnsi="Aptos"/>
+          <w:sz w:val="24"/>
+          <w:szCs w:val="24"/>
+        </w:rPr>
+        <w:br/>
+        <w:t>encore.</w:t>
       </w:r>
     </w:p>
     <w:sectPr>

</xml_diff>